<commit_message>
update part 1 and part 2
update new answers
</commit_message>
<xml_diff>
--- a/doc/QBUS6810_assignment_instructions.docx
+++ b/doc/QBUS6810_assignment_instructions.docx
@@ -1607,143 +1607,17 @@
         <w:jc w:val="left"/>
         <w:rPr>
           <w:rFonts w:eastAsiaTheme="minorEastAsia"/>
-        </w:rPr>
-      </w:pPr>
-    </w:p>
-    <w:p>
-      <w:pPr>
-        <w:spacing w:after="0" w:line="257" w:lineRule="auto"/>
-        <w:ind w:left="0" w:right="0" w:firstLine="0"/>
-        <w:jc w:val="left"/>
-        <w:rPr>
-          <w:rFonts w:eastAsiaTheme="minorEastAsia"/>
-        </w:rPr>
-      </w:pPr>
-      <w:r>
-        <w:rPr>
-          <w:rFonts w:eastAsiaTheme="minorEastAsia" w:hint="eastAsia"/>
           <w:b/>
           <w:bCs/>
         </w:rPr>
-        <w:t>Business problem</w:t>
-      </w:r>
-      <w:r>
-        <w:rPr>
-          <w:rFonts w:eastAsiaTheme="minorEastAsia" w:hint="eastAsia"/>
-        </w:rPr>
-        <w:t>: The Cook County Assessor</w:t>
-      </w:r>
-      <w:r>
-        <w:rPr>
-          <w:rFonts w:eastAsiaTheme="minorEastAsia"/>
-        </w:rPr>
-        <w:t>’</w:t>
-      </w:r>
-      <w:r>
-        <w:rPr>
-          <w:rFonts w:eastAsiaTheme="minorEastAsia" w:hint="eastAsia"/>
-        </w:rPr>
-        <w:t xml:space="preserve">s Office must assess a large amount of residential properties in Cook County for property tax purposes. Since many homes do not have recent recorded sale, their market value cannot be observed directly. However, the office still needs to estimate what each property would sell for as of </w:t>
-      </w:r>
-      <w:r>
-        <w:rPr>
-          <w:rFonts w:eastAsiaTheme="minorEastAsia" w:hint="eastAsia"/>
-          <w:b/>
-          <w:bCs/>
-        </w:rPr>
-        <w:t>a specified valuation date</w:t>
-      </w:r>
-      <w:r>
-        <w:rPr>
-          <w:rFonts w:eastAsiaTheme="minorEastAsia" w:hint="eastAsia"/>
-        </w:rPr>
-        <w:t xml:space="preserve">. </w:t>
-      </w:r>
-    </w:p>
-    <w:p>
-      <w:pPr>
-        <w:spacing w:after="0" w:line="257" w:lineRule="auto"/>
-        <w:ind w:left="0" w:right="0" w:firstLine="0"/>
-        <w:jc w:val="left"/>
-        <w:rPr>
-          <w:rFonts w:eastAsiaTheme="minorEastAsia"/>
-        </w:rPr>
-      </w:pPr>
-      <w:r>
-        <w:rPr>
-          <w:rFonts w:eastAsiaTheme="minorEastAsia" w:hint="eastAsia"/>
-          <w:b/>
-          <w:bCs/>
-        </w:rPr>
-        <w:t>User</w:t>
-      </w:r>
-      <w:r>
-        <w:rPr>
-          <w:rFonts w:eastAsiaTheme="minorEastAsia" w:hint="eastAsia"/>
-        </w:rPr>
-        <w:t>: Property analyst in residential valuation team</w:t>
-      </w:r>
-    </w:p>
-    <w:p>
-      <w:pPr>
-        <w:spacing w:after="0" w:line="257" w:lineRule="auto"/>
-        <w:ind w:left="0" w:right="0" w:firstLine="0"/>
-        <w:jc w:val="left"/>
-        <w:rPr>
-          <w:rFonts w:eastAsiaTheme="minorEastAsia"/>
-        </w:rPr>
-      </w:pPr>
-      <w:r>
-        <w:rPr>
-          <w:rFonts w:eastAsiaTheme="minorEastAsia" w:hint="eastAsia"/>
-          <w:b/>
-          <w:bCs/>
-        </w:rPr>
-        <w:t>Target outpu</w:t>
-      </w:r>
-      <w:r>
-        <w:rPr>
-          <w:rFonts w:eastAsiaTheme="minorEastAsia" w:hint="eastAsia"/>
-        </w:rPr>
-        <w:t>t: Provide an initial price estimate for a home without a recent sale</w:t>
-      </w:r>
-      <w:r>
-        <w:rPr>
-          <w:rFonts w:eastAsiaTheme="minorEastAsia" w:hint="eastAsia"/>
-        </w:rPr>
-        <w:t xml:space="preserve">. This is a human-in-the-loop process: the model generates a first-pass estimate, and the analyst combines it with inspection information and professional judgement to determine the final assessed value. The model does not directly generate tax bills. </w:t>
-      </w:r>
-    </w:p>
-    <w:p>
-      <w:pPr>
-        <w:spacing w:after="0" w:line="257" w:lineRule="auto"/>
-        <w:ind w:left="0" w:right="0" w:firstLine="0"/>
-        <w:jc w:val="left"/>
-        <w:rPr>
-          <w:rFonts w:eastAsiaTheme="minorEastAsia"/>
-        </w:rPr>
-      </w:pPr>
-      <w:r>
-        <w:rPr>
-          <w:rFonts w:eastAsiaTheme="minorEastAsia" w:hint="eastAsia"/>
-          <w:b/>
-          <w:bCs/>
-        </w:rPr>
-        <w:t>Practical value</w:t>
-      </w:r>
-      <w:r>
-        <w:rPr>
-          <w:rFonts w:eastAsiaTheme="minorEastAsia" w:hint="eastAsia"/>
-        </w:rPr>
-        <w:t xml:space="preserve">: </w:t>
-      </w:r>
+      </w:pPr>
     </w:p>
     <w:p>
       <w:pPr>
         <w:pStyle w:val="a6"/>
         <w:numPr>
           <w:ilvl w:val="0"/>
-          <w:numId w:val="7"/>
+          <w:numId w:val="8"/>
         </w:numPr>
         <w:spacing w:after="0" w:line="257" w:lineRule="auto"/>
         <w:ind w:right="0" w:firstLineChars="0"/>
@@ -1756,72 +1630,209 @@
         <w:rPr>
           <w:rFonts w:eastAsiaTheme="minorEastAsia" w:hint="eastAsia"/>
         </w:rPr>
-        <w:t>Reduced repetitive manual work: the model can generate initial estimates for large numbers of homes without recent sales in bulk. Then the analyst can pay more attention on reviewing and correcting these estimates.</w:t>
+        <w:t>The Cook County Assessor</w:t>
+      </w:r>
+      <w:r>
+        <w:rPr>
+          <w:rFonts w:eastAsiaTheme="minorEastAsia"/>
+        </w:rPr>
+        <w:t>’</w:t>
+      </w:r>
+      <w:r>
+        <w:rPr>
+          <w:rFonts w:eastAsiaTheme="minorEastAsia" w:hint="eastAsia"/>
+        </w:rPr>
+        <w:t xml:space="preserve">s Office must assess a large amount of residential properties in Cook County for property tax purposes. Since many homes do not have recent recorded sale, their market value cannot be observed directly. However, the office still needs to estimate what each property would sell for as of </w:t>
+      </w:r>
+      <w:r>
+        <w:rPr>
+          <w:rFonts w:eastAsiaTheme="minorEastAsia" w:hint="eastAsia"/>
+          <w:b/>
+          <w:bCs/>
+        </w:rPr>
+        <w:t>a specified valuation date</w:t>
+      </w:r>
+      <w:r>
+        <w:rPr>
+          <w:rFonts w:eastAsiaTheme="minorEastAsia" w:hint="eastAsia"/>
+        </w:rPr>
+        <w:t xml:space="preserve">. </w:t>
       </w:r>
     </w:p>
     <w:p>
       <w:pPr>
         <w:pStyle w:val="a6"/>
-        <w:numPr>
-          <w:ilvl w:val="0"/>
-          <w:numId w:val="7"/>
-        </w:numPr>
         <w:spacing w:after="0" w:line="257" w:lineRule="auto"/>
-        <w:ind w:right="0" w:firstLineChars="0"/>
+        <w:ind w:left="440" w:right="0" w:firstLineChars="0" w:firstLine="0"/>
         <w:jc w:val="left"/>
         <w:rPr>
           <w:rFonts w:eastAsiaTheme="minorEastAsia"/>
         </w:rPr>
       </w:pPr>
+    </w:p>
+    <w:p>
+      <w:pPr>
+        <w:pStyle w:val="a6"/>
+        <w:spacing w:after="0" w:line="257" w:lineRule="auto"/>
+        <w:ind w:left="440" w:right="0" w:firstLineChars="0" w:firstLine="0"/>
+        <w:jc w:val="left"/>
+        <w:rPr>
+          <w:rFonts w:eastAsiaTheme="minorEastAsia"/>
+        </w:rPr>
+      </w:pPr>
+      <w:r>
+        <w:rPr>
+          <w:rFonts w:eastAsiaTheme="minorEastAsia"/>
+        </w:rPr>
+        <w:t>The proposed use of the model is to provide an initial price estimate for a home without a recent</w:t>
+      </w:r>
+    </w:p>
+    <w:p>
+      <w:pPr>
+        <w:pStyle w:val="a6"/>
+        <w:spacing w:after="0" w:line="257" w:lineRule="auto"/>
+        <w:ind w:left="440" w:right="0" w:firstLineChars="0" w:firstLine="0"/>
+        <w:jc w:val="left"/>
+        <w:rPr>
+          <w:rFonts w:eastAsiaTheme="minorEastAsia"/>
+        </w:rPr>
+      </w:pPr>
+      <w:r>
+        <w:rPr>
+          <w:rFonts w:eastAsiaTheme="minorEastAsia"/>
+        </w:rPr>
+        <w:t>sale. This estimate is intended for a property analyst in the residential valuation team, who</w:t>
+      </w:r>
       <w:r>
         <w:rPr>
           <w:rFonts w:eastAsiaTheme="minorEastAsia" w:hint="eastAsia"/>
         </w:rPr>
-        <w:t xml:space="preserve">Improved consistency: the model can provide a reproducible starting point for comparable homes, reducing subjective variation. </w:t>
+        <w:t xml:space="preserve"> </w:t>
+      </w:r>
+      <w:r>
+        <w:rPr>
+          <w:rFonts w:eastAsiaTheme="minorEastAsia"/>
+        </w:rPr>
+        <w:t>combines the model output with inspection information and professional judgement to determine</w:t>
+      </w:r>
+      <w:r>
+        <w:rPr>
+          <w:rFonts w:eastAsiaTheme="minorEastAsia" w:hint="eastAsia"/>
+        </w:rPr>
+        <w:t xml:space="preserve"> </w:t>
+      </w:r>
+      <w:r>
+        <w:rPr>
+          <w:rFonts w:eastAsiaTheme="minorEastAsia"/>
+        </w:rPr>
+        <w:t>the final assessed value. The process is explicitly human-in-the-loop: the model generates a first-pass estimate, and the analyst reviews and corrects it. The model does not directly generate tax</w:t>
+      </w:r>
+      <w:r>
+        <w:rPr>
+          <w:rFonts w:eastAsiaTheme="minorEastAsia" w:hint="eastAsia"/>
+        </w:rPr>
+        <w:t>.</w:t>
       </w:r>
     </w:p>
     <w:p>
       <w:pPr>
         <w:pStyle w:val="a6"/>
-        <w:numPr>
-          <w:ilvl w:val="0"/>
-          <w:numId w:val="7"/>
-        </w:numPr>
         <w:spacing w:after="0" w:line="257" w:lineRule="auto"/>
-        <w:ind w:right="0" w:firstLineChars="0"/>
+        <w:ind w:left="440" w:right="0" w:firstLineChars="0" w:firstLine="0"/>
         <w:jc w:val="left"/>
         <w:rPr>
           <w:rFonts w:eastAsiaTheme="minorEastAsia"/>
         </w:rPr>
       </w:pPr>
-      <w:r>
+    </w:p>
+    <w:p>
+      <w:pPr>
+        <w:pStyle w:val="a6"/>
+        <w:spacing w:after="0" w:line="257" w:lineRule="auto"/>
+        <w:ind w:left="440" w:right="0" w:firstLineChars="0" w:firstLine="0"/>
+        <w:jc w:val="left"/>
         <w:rPr>
           <w:rFonts w:eastAsiaTheme="minorEastAsia" w:hint="eastAsia"/>
         </w:rPr>
-        <w:t>Scalability: a model-based approach supports the office</w:t>
-      </w:r>
+      </w:pPr>
       <w:r>
         <w:rPr>
           <w:rFonts w:eastAsiaTheme="minorEastAsia"/>
         </w:rPr>
-        <w:t>’</w:t>
+        <w:t>This project offers three practical benefits. First, it reduces repetitive manual work, because the</w:t>
       </w:r>
       <w:r>
         <w:rPr>
           <w:rFonts w:eastAsiaTheme="minorEastAsia" w:hint="eastAsia"/>
         </w:rPr>
-        <w:t xml:space="preserve">s need to value abundant properties at scale, which is preferable to pricing each home individually by hand. </w:t>
-      </w:r>
-    </w:p>
-    <w:p>
-      <w:pPr>
-        <w:spacing w:after="0" w:line="257" w:lineRule="auto"/>
-        <w:ind w:left="0" w:right="0" w:firstLine="0"/>
-        <w:jc w:val="left"/>
+        <w:t xml:space="preserve"> </w:t>
+      </w:r>
+      <w:r>
         <w:rPr>
           <w:rFonts w:eastAsiaTheme="minorEastAsia"/>
         </w:rPr>
-      </w:pPr>
+        <w:t>model can generate initial estimates for large numbers of homes without recent sales in bulk</w:t>
+      </w:r>
+      <w:r>
+        <w:rPr>
+          <w:rFonts w:eastAsiaTheme="minorEastAsia" w:hint="eastAsia"/>
+        </w:rPr>
+        <w:t xml:space="preserve">, </w:t>
+      </w:r>
+      <w:r>
+        <w:rPr>
+          <w:rFonts w:eastAsiaTheme="minorEastAsia"/>
+        </w:rPr>
+        <w:t>allowing analysts to concentrate on reviewing and correcting estimates rather than pricing each</w:t>
+      </w:r>
+      <w:r>
+        <w:rPr>
+          <w:rFonts w:eastAsiaTheme="minorEastAsia" w:hint="eastAsia"/>
+        </w:rPr>
+        <w:t xml:space="preserve"> </w:t>
+      </w:r>
+      <w:r>
+        <w:rPr>
+          <w:rFonts w:eastAsiaTheme="minorEastAsia"/>
+        </w:rPr>
+        <w:t>home from scratch. Second, it improves consistency, as the model provides a reproducible starting</w:t>
+      </w:r>
+      <w:r>
+        <w:rPr>
+          <w:rFonts w:eastAsiaTheme="minorEastAsia" w:hint="eastAsia"/>
+        </w:rPr>
+        <w:t xml:space="preserve"> </w:t>
+      </w:r>
+      <w:r>
+        <w:rPr>
+          <w:rFonts w:eastAsiaTheme="minorEastAsia"/>
+        </w:rPr>
+        <w:t>point for comparable homes and thereby reduces subjective variation between analysts. Third, it</w:t>
+      </w:r>
+      <w:r>
+        <w:rPr>
+          <w:rFonts w:eastAsiaTheme="minorEastAsia" w:hint="eastAsia"/>
+        </w:rPr>
+        <w:t xml:space="preserve"> </w:t>
+      </w:r>
+      <w:r>
+        <w:rPr>
+          <w:rFonts w:eastAsiaTheme="minorEastAsia"/>
+        </w:rPr>
+        <w:t>supports scalability, since a model-based approach can value abundant properties at scale far</w:t>
+      </w:r>
+      <w:r>
+        <w:rPr>
+          <w:rFonts w:eastAsiaTheme="minorEastAsia" w:hint="eastAsia"/>
+        </w:rPr>
+        <w:t xml:space="preserve"> </w:t>
+      </w:r>
+      <w:r>
+        <w:rPr>
+          <w:rFonts w:eastAsiaTheme="minorEastAsia"/>
+        </w:rPr>
+        <w:t>more readily than pricing each home individually by hand</w:t>
+      </w:r>
     </w:p>
     <w:p>
       <w:pPr>
@@ -1860,6 +1871,63 @@
     </w:p>
     <w:p>
       <w:pPr>
+        <w:pStyle w:val="a6"/>
+        <w:numPr>
+          <w:ilvl w:val="0"/>
+          <w:numId w:val="8"/>
+        </w:numPr>
+        <w:spacing w:after="0" w:line="257" w:lineRule="auto"/>
+        <w:ind w:right="0" w:firstLineChars="0"/>
+        <w:jc w:val="left"/>
+        <w:rPr>
+          <w:rFonts w:eastAsiaTheme="minorEastAsia"/>
+        </w:rPr>
+      </w:pPr>
+      <w:r>
+        <w:rPr>
+          <w:rFonts w:eastAsiaTheme="minorEastAsia" w:hint="eastAsia"/>
+        </w:rPr>
+        <w:t>In the property csv, each row means a specified property</w:t>
+      </w:r>
+      <w:r>
+        <w:rPr>
+          <w:rFonts w:eastAsiaTheme="minorEastAsia"/>
+        </w:rPr>
+        <w:t>’</w:t>
+      </w:r>
+      <w:r>
+        <w:rPr>
+          <w:rFonts w:eastAsiaTheme="minorEastAsia" w:hint="eastAsia"/>
+        </w:rPr>
+        <w:t>s information collected in 2022. Each row</w:t>
+      </w:r>
+      <w:r>
+        <w:rPr>
+          <w:rFonts w:eastAsiaTheme="minorEastAsia"/>
+        </w:rPr>
+        <w:t>’</w:t>
+      </w:r>
+      <w:r>
+        <w:rPr>
+          <w:rFonts w:eastAsiaTheme="minorEastAsia" w:hint="eastAsia"/>
+        </w:rPr>
+        <w:t>s property is unique, after checking duplication of property id. In the sales csv, each row means a specified transaction information during 2023 and 2025. Each row</w:t>
+      </w:r>
+      <w:r>
+        <w:rPr>
+          <w:rFonts w:eastAsiaTheme="minorEastAsia"/>
+        </w:rPr>
+        <w:t>’</w:t>
+      </w:r>
+      <w:r>
+        <w:rPr>
+          <w:rFonts w:eastAsiaTheme="minorEastAsia" w:hint="eastAsia"/>
+        </w:rPr>
+        <w:t xml:space="preserve">s transaction is unique, but property id has duplication. This means that some of these properties experienced more than one transaction. This circumstance is compliant and consistent with the real world. </w:t>
+      </w:r>
+    </w:p>
+    <w:p>
+      <w:pPr>
         <w:spacing w:after="0" w:line="257" w:lineRule="auto"/>
         <w:ind w:left="0" w:right="0" w:firstLine="0"/>
         <w:jc w:val="left"/>
@@ -1884,7 +1952,7 @@
         <w:ind w:left="0" w:right="0" w:firstLine="0"/>
         <w:jc w:val="left"/>
         <w:rPr>
-          <w:rFonts w:eastAsiaTheme="minorEastAsia" w:hint="eastAsia"/>
+          <w:rFonts w:eastAsiaTheme="minorEastAsia"/>
         </w:rPr>
       </w:pPr>
     </w:p>
@@ -1894,7 +1962,7 @@
         <w:ind w:left="0" w:right="0" w:firstLine="0"/>
         <w:jc w:val="left"/>
         <w:rPr>
-          <w:rFonts w:eastAsiaTheme="minorEastAsia" w:hint="eastAsia"/>
+          <w:rFonts w:eastAsiaTheme="minorEastAsia"/>
         </w:rPr>
       </w:pPr>
     </w:p>
@@ -2507,6 +2575,95 @@
     </w:lvl>
   </w:abstractNum>
   <w:abstractNum w:abstractNumId="2" w15:restartNumberingAfterBreak="0">
+    <w:nsid w:val="18825EB9"/>
+    <w:multiLevelType w:val="hybridMultilevel"/>
+    <w:tmpl w:val="428A0756"/>
+    <w:lvl w:ilvl="0" w:tplc="79D09C8E">
+      <w:start w:val="1"/>
+      <w:numFmt w:val="decimal"/>
+      <w:lvlText w:val="%1a."/>
+      <w:lvlJc w:val="left"/>
+      <w:pPr>
+        <w:ind w:left="440" w:hanging="440"/>
+      </w:pPr>
+      <w:rPr>
+        <w:rFonts w:hint="eastAsia"/>
+      </w:rPr>
+    </w:lvl>
+    <w:lvl w:ilvl="1" w:tplc="04090019" w:tentative="1">
+      <w:start w:val="1"/>
+      <w:numFmt w:val="lowerLetter"/>
+      <w:lvlText w:val="%2)"/>
+      <w:lvlJc w:val="left"/>
+      <w:pPr>
+        <w:ind w:left="880" w:hanging="440"/>
+      </w:pPr>
+    </w:lvl>
+    <w:lvl w:ilvl="2" w:tplc="0409001B" w:tentative="1">
+      <w:start w:val="1"/>
+      <w:numFmt w:val="lowerRoman"/>
+      <w:lvlText w:val="%3."/>
+      <w:lvlJc w:val="right"/>
+      <w:pPr>
+        <w:ind w:left="1320" w:hanging="440"/>
+      </w:pPr>
+    </w:lvl>
+    <w:lvl w:ilvl="3" w:tplc="0409000F" w:tentative="1">
+      <w:start w:val="1"/>
+      <w:numFmt w:val="decimal"/>
+      <w:lvlText w:val="%4."/>
+      <w:lvlJc w:val="left"/>
+      <w:pPr>
+        <w:ind w:left="1760" w:hanging="440"/>
+      </w:pPr>
+    </w:lvl>
+    <w:lvl w:ilvl="4" w:tplc="04090019" w:tentative="1">
+      <w:start w:val="1"/>
+      <w:numFmt w:val="lowerLetter"/>
+      <w:lvlText w:val="%5)"/>
+      <w:lvlJc w:val="left"/>
+      <w:pPr>
+        <w:ind w:left="2200" w:hanging="440"/>
+      </w:pPr>
+    </w:lvl>
+    <w:lvl w:ilvl="5" w:tplc="0409001B" w:tentative="1">
+      <w:start w:val="1"/>
+      <w:numFmt w:val="lowerRoman"/>
+      <w:lvlText w:val="%6."/>
+      <w:lvlJc w:val="right"/>
+      <w:pPr>
+        <w:ind w:left="2640" w:hanging="440"/>
+      </w:pPr>
+    </w:lvl>
+    <w:lvl w:ilvl="6" w:tplc="0409000F" w:tentative="1">
+      <w:start w:val="1"/>
+      <w:numFmt w:val="decimal"/>
+      <w:lvlText w:val="%7."/>
+      <w:lvlJc w:val="left"/>
+      <w:pPr>
+        <w:ind w:left="3080" w:hanging="440"/>
+      </w:pPr>
+    </w:lvl>
+    <w:lvl w:ilvl="7" w:tplc="04090019" w:tentative="1">
+      <w:start w:val="1"/>
+      <w:numFmt w:val="lowerLetter"/>
+      <w:lvlText w:val="%8)"/>
+      <w:lvlJc w:val="left"/>
+      <w:pPr>
+        <w:ind w:left="3520" w:hanging="440"/>
+      </w:pPr>
+    </w:lvl>
+    <w:lvl w:ilvl="8" w:tplc="0409001B" w:tentative="1">
+      <w:start w:val="1"/>
+      <w:numFmt w:val="lowerRoman"/>
+      <w:lvlText w:val="%9."/>
+      <w:lvlJc w:val="right"/>
+      <w:pPr>
+        <w:ind w:left="3960" w:hanging="440"/>
+      </w:pPr>
+    </w:lvl>
+  </w:abstractNum>
+  <w:abstractNum w:abstractNumId="3" w15:restartNumberingAfterBreak="0">
     <w:nsid w:val="304B7422"/>
     <w:multiLevelType w:val="hybridMultilevel"/>
     <w:tmpl w:val="FAF63480"/>
@@ -2718,7 +2875,7 @@
       </w:rPr>
     </w:lvl>
   </w:abstractNum>
-  <w:abstractNum w:abstractNumId="3" w15:restartNumberingAfterBreak="0">
+  <w:abstractNum w:abstractNumId="4" w15:restartNumberingAfterBreak="0">
     <w:nsid w:val="32053825"/>
     <w:multiLevelType w:val="hybridMultilevel"/>
     <w:tmpl w:val="35D6C05E"/>
@@ -2807,7 +2964,7 @@
       </w:pPr>
     </w:lvl>
   </w:abstractNum>
-  <w:abstractNum w:abstractNumId="4" w15:restartNumberingAfterBreak="0">
+  <w:abstractNum w:abstractNumId="5" w15:restartNumberingAfterBreak="0">
     <w:nsid w:val="42FE51F4"/>
     <w:multiLevelType w:val="hybridMultilevel"/>
     <w:tmpl w:val="A226018E"/>
@@ -3019,7 +3176,7 @@
       </w:rPr>
     </w:lvl>
   </w:abstractNum>
-  <w:abstractNum w:abstractNumId="5" w15:restartNumberingAfterBreak="0">
+  <w:abstractNum w:abstractNumId="6" w15:restartNumberingAfterBreak="0">
     <w:nsid w:val="4E073781"/>
     <w:multiLevelType w:val="hybridMultilevel"/>
     <w:tmpl w:val="2F88F9A2"/>
@@ -3108,7 +3265,7 @@
       </w:pPr>
     </w:lvl>
   </w:abstractNum>
-  <w:abstractNum w:abstractNumId="6" w15:restartNumberingAfterBreak="0">
+  <w:abstractNum w:abstractNumId="7" w15:restartNumberingAfterBreak="0">
     <w:nsid w:val="544073F8"/>
     <w:multiLevelType w:val="hybridMultilevel"/>
     <w:tmpl w:val="78BC3FD6"/>
@@ -3334,22 +3491,25 @@
     <w:abstractNumId w:val="1"/>
   </w:num>
   <w:num w:numId="2" w16cid:durableId="1028333939">
-    <w:abstractNumId w:val="4"/>
+    <w:abstractNumId w:val="5"/>
   </w:num>
   <w:num w:numId="3" w16cid:durableId="2041003331">
-    <w:abstractNumId w:val="2"/>
+    <w:abstractNumId w:val="3"/>
   </w:num>
   <w:num w:numId="4" w16cid:durableId="543834558">
     <w:abstractNumId w:val="0"/>
   </w:num>
   <w:num w:numId="5" w16cid:durableId="1155144563">
+    <w:abstractNumId w:val="7"/>
+  </w:num>
+  <w:num w:numId="6" w16cid:durableId="322321522">
+    <w:abstractNumId w:val="4"/>
+  </w:num>
+  <w:num w:numId="7" w16cid:durableId="1626158007">
     <w:abstractNumId w:val="6"/>
   </w:num>
-  <w:num w:numId="6" w16cid:durableId="322321522">
-    <w:abstractNumId w:val="3"/>
-  </w:num>
-  <w:num w:numId="7" w16cid:durableId="1626158007">
-    <w:abstractNumId w:val="5"/>
+  <w:num w:numId="8" w16cid:durableId="1346588590">
+    <w:abstractNumId w:val="2"/>
   </w:num>
 </w:numbering>
 </file>

</xml_diff>

<commit_message>
updated new part 1
updated new part 1
</commit_message>
<xml_diff>
--- a/doc/QBUS6810_assignment_instructions.docx
+++ b/doc/QBUS6810_assignment_instructions.docx
@@ -27,7 +27,7 @@
     </w:p>
     <w:p>
       <w:pPr>
-        <w:pStyle w:val="Heading1"/>
+        <w:pStyle w:val="1"/>
         <w:ind w:left="477" w:right="0" w:hanging="484"/>
       </w:pPr>
       <w:r>
@@ -77,7 +77,7 @@
     </w:p>
     <w:p>
       <w:pPr>
-        <w:pStyle w:val="Heading1"/>
+        <w:pStyle w:val="1"/>
         <w:ind w:left="477" w:right="0" w:hanging="484"/>
       </w:pPr>
       <w:r>
@@ -228,7 +228,7 @@
     </w:p>
     <w:p>
       <w:pPr>
-        <w:pStyle w:val="Heading1"/>
+        <w:pStyle w:val="1"/>
         <w:ind w:left="477" w:right="0" w:hanging="484"/>
       </w:pPr>
       <w:r>
@@ -300,7 +300,7 @@
     </w:p>
     <w:p>
       <w:pPr>
-        <w:pStyle w:val="Heading1"/>
+        <w:pStyle w:val="1"/>
         <w:ind w:left="477" w:right="0" w:hanging="484"/>
       </w:pPr>
       <w:r>
@@ -318,7 +318,7 @@
     </w:p>
     <w:p>
       <w:pPr>
-        <w:pStyle w:val="Heading2"/>
+        <w:pStyle w:val="2"/>
         <w:ind w:left="3"/>
       </w:pPr>
       <w:r>
@@ -345,7 +345,7 @@
     </w:p>
     <w:p>
       <w:pPr>
-        <w:pStyle w:val="Heading2"/>
+        <w:pStyle w:val="2"/>
         <w:ind w:left="3"/>
       </w:pPr>
       <w:r>
@@ -426,7 +426,7 @@
     </w:p>
     <w:p>
       <w:pPr>
-        <w:pStyle w:val="Heading2"/>
+        <w:pStyle w:val="2"/>
         <w:ind w:left="3"/>
       </w:pPr>
       <w:r>
@@ -512,7 +512,7 @@
     </w:p>
     <w:tbl>
       <w:tblPr>
-        <w:tblStyle w:val="PlainTable1"/>
+        <w:tblStyle w:val="11"/>
         <w:tblW w:w="0" w:type="auto"/>
         <w:jc w:val="center"/>
         <w:tblLayout w:type="fixed"/>
@@ -748,7 +748,7 @@
       <w:pPr>
         <w:ind w:left="443" w:hanging="437"/>
         <w:rPr>
-          <w:rFonts w:eastAsiaTheme="minorEastAsia" w:hint="eastAsia"/>
+          <w:rFonts w:eastAsiaTheme="minorEastAsia"/>
         </w:rPr>
       </w:pPr>
     </w:p>
@@ -811,7 +811,7 @@
     </w:p>
     <w:p>
       <w:pPr>
-        <w:pStyle w:val="Heading2"/>
+        <w:pStyle w:val="2"/>
         <w:ind w:left="3"/>
       </w:pPr>
       <w:r>
@@ -1208,7 +1208,7 @@
     </w:p>
     <w:p>
       <w:pPr>
-        <w:pStyle w:val="Heading2"/>
+        <w:pStyle w:val="2"/>
         <w:ind w:left="3"/>
       </w:pPr>
       <w:r>
@@ -1296,7 +1296,7 @@
     </w:p>
     <w:p>
       <w:pPr>
-        <w:pStyle w:val="Heading1"/>
+        <w:pStyle w:val="1"/>
         <w:ind w:left="477" w:right="0" w:hanging="484"/>
       </w:pPr>
       <w:r>
@@ -1456,7 +1456,7 @@
     </w:p>
     <w:p>
       <w:pPr>
-        <w:pStyle w:val="Heading1"/>
+        <w:pStyle w:val="1"/>
         <w:spacing w:after="169"/>
         <w:ind w:left="477" w:right="0" w:hanging="484"/>
       </w:pPr>
@@ -1537,7 +1537,7 @@
     </w:p>
     <w:p>
       <w:pPr>
-        <w:pStyle w:val="Heading1"/>
+        <w:pStyle w:val="1"/>
         <w:ind w:left="477" w:right="0" w:hanging="484"/>
       </w:pPr>
       <w:r>
@@ -1574,7 +1574,7 @@
     </w:p>
     <w:p>
       <w:pPr>
-        <w:pStyle w:val="ListParagraph"/>
+        <w:pStyle w:val="a6"/>
         <w:numPr>
           <w:ilvl w:val="0"/>
           <w:numId w:val="6"/>
@@ -1628,139 +1628,17 @@
         <w:jc w:val="left"/>
         <w:rPr>
           <w:rFonts w:eastAsiaTheme="minorEastAsia"/>
-        </w:rPr>
-      </w:pPr>
-    </w:p>
-    <w:p>
-      <w:pPr>
-        <w:spacing w:line="257" w:lineRule="auto"/>
-        <w:jc w:val="left"/>
-        <w:rPr>
-          <w:rFonts w:eastAsiaTheme="minorEastAsia"/>
-        </w:rPr>
-      </w:pPr>
-      <w:r>
-        <w:rPr>
-          <w:rFonts w:eastAsiaTheme="minorEastAsia" w:hint="eastAsia"/>
           <w:b/>
           <w:bCs/>
         </w:rPr>
-        <w:t>Business problem</w:t>
-      </w:r>
-      <w:r>
-        <w:rPr>
-          <w:rFonts w:eastAsiaTheme="minorEastAsia" w:hint="eastAsia"/>
-        </w:rPr>
-        <w:t>: The Cook County Assessor</w:t>
-      </w:r>
-      <w:r>
-        <w:rPr>
-          <w:rFonts w:eastAsiaTheme="minorEastAsia"/>
-        </w:rPr>
-        <w:t>’</w:t>
-      </w:r>
-      <w:r>
-        <w:rPr>
-          <w:rFonts w:eastAsiaTheme="minorEastAsia" w:hint="eastAsia"/>
-        </w:rPr>
-        <w:t xml:space="preserve">s Office must assess a large amount of residential properties in Cook County for property tax purposes. Since many homes do not have recent recorded sale, their market value cannot be observed directly. However, the office still needs to estimate what each property would sell for as of </w:t>
-      </w:r>
-      <w:r>
-        <w:rPr>
-          <w:rFonts w:eastAsiaTheme="minorEastAsia" w:hint="eastAsia"/>
-          <w:b/>
-          <w:bCs/>
-        </w:rPr>
-        <w:t>a specified valuation date</w:t>
-      </w:r>
-      <w:r>
-        <w:rPr>
-          <w:rFonts w:eastAsiaTheme="minorEastAsia" w:hint="eastAsia"/>
-        </w:rPr>
-        <w:t xml:space="preserve">. </w:t>
-      </w:r>
-    </w:p>
-    <w:p>
-      <w:pPr>
-        <w:spacing w:line="257" w:lineRule="auto"/>
-        <w:jc w:val="left"/>
-        <w:rPr>
-          <w:rFonts w:eastAsiaTheme="minorEastAsia"/>
-        </w:rPr>
-      </w:pPr>
-      <w:r>
-        <w:rPr>
-          <w:rFonts w:eastAsiaTheme="minorEastAsia" w:hint="eastAsia"/>
-          <w:b/>
-          <w:bCs/>
-        </w:rPr>
-        <w:t>User</w:t>
-      </w:r>
-      <w:r>
-        <w:rPr>
-          <w:rFonts w:eastAsiaTheme="minorEastAsia" w:hint="eastAsia"/>
-        </w:rPr>
-        <w:t>: Property analyst in residential valuation team</w:t>
-      </w:r>
-    </w:p>
-    <w:p>
-      <w:pPr>
-        <w:spacing w:line="257" w:lineRule="auto"/>
-        <w:jc w:val="left"/>
-        <w:rPr>
-          <w:rFonts w:eastAsiaTheme="minorEastAsia"/>
-        </w:rPr>
-      </w:pPr>
-      <w:r>
-        <w:rPr>
-          <w:rFonts w:eastAsiaTheme="minorEastAsia" w:hint="eastAsia"/>
-          <w:b/>
-          <w:bCs/>
-        </w:rPr>
-        <w:t>Target outpu</w:t>
-      </w:r>
-      <w:r>
-        <w:rPr>
-          <w:rFonts w:eastAsiaTheme="minorEastAsia" w:hint="eastAsia"/>
-        </w:rPr>
-        <w:t>t: Provide an initial price estimate for a home without a recent sale</w:t>
-      </w:r>
-      <w:r>
-        <w:rPr>
-          <w:rFonts w:eastAsiaTheme="minorEastAsia" w:hint="eastAsia"/>
-        </w:rPr>
-        <w:t xml:space="preserve">. This is a human-in-the-loop process: the model generates a first-pass estimate, and the analyst combines it with inspection information and professional judgement to determine the final assessed value. The model does not directly generate tax bills. </w:t>
-      </w:r>
-    </w:p>
-    <w:p>
-      <w:pPr>
-        <w:spacing w:line="257" w:lineRule="auto"/>
-        <w:jc w:val="left"/>
-        <w:rPr>
-          <w:rFonts w:eastAsiaTheme="minorEastAsia"/>
-        </w:rPr>
-      </w:pPr>
-      <w:r>
-        <w:rPr>
-          <w:rFonts w:eastAsiaTheme="minorEastAsia" w:hint="eastAsia"/>
-          <w:b/>
-          <w:bCs/>
-        </w:rPr>
-        <w:t>Practical value</w:t>
-      </w:r>
-      <w:r>
-        <w:rPr>
-          <w:rFonts w:eastAsiaTheme="minorEastAsia" w:hint="eastAsia"/>
-        </w:rPr>
-        <w:t xml:space="preserve">: </w:t>
-      </w:r>
-    </w:p>
-    <w:p>
-      <w:pPr>
-        <w:pStyle w:val="ListParagraph"/>
+      </w:pPr>
+    </w:p>
+    <w:p>
+      <w:pPr>
+        <w:pStyle w:val="a6"/>
         <w:numPr>
           <w:ilvl w:val="0"/>
-          <w:numId w:val="7"/>
+          <w:numId w:val="8"/>
         </w:numPr>
         <w:spacing w:line="257" w:lineRule="auto"/>
         <w:ind w:firstLineChars="0"/>
@@ -1773,61 +1651,208 @@
         <w:rPr>
           <w:rFonts w:eastAsiaTheme="minorEastAsia" w:hint="eastAsia"/>
         </w:rPr>
-        <w:t>Reduced repetitive manual work: the model can generate initial estimates for large numbers of homes without recent sales in bulk. Then the analyst can pay more attention on reviewing and correcting these estimates.</w:t>
-      </w:r>
-    </w:p>
-    <w:p>
-      <w:pPr>
-        <w:pStyle w:val="ListParagraph"/>
-        <w:numPr>
-          <w:ilvl w:val="0"/>
-          <w:numId w:val="7"/>
-        </w:numPr>
+        <w:t>The Cook County Assessor</w:t>
+      </w:r>
+      <w:r>
+        <w:rPr>
+          <w:rFonts w:eastAsiaTheme="minorEastAsia"/>
+        </w:rPr>
+        <w:t>’</w:t>
+      </w:r>
+      <w:r>
+        <w:rPr>
+          <w:rFonts w:eastAsiaTheme="minorEastAsia" w:hint="eastAsia"/>
+        </w:rPr>
+        <w:t xml:space="preserve">s Office must assess a large amount of residential properties in Cook County for property tax purposes. Since many homes do not have recent recorded sale, their market value cannot be observed directly. However, the office still needs to estimate what each property would sell for as of </w:t>
+      </w:r>
+      <w:r>
+        <w:rPr>
+          <w:rFonts w:eastAsiaTheme="minorEastAsia" w:hint="eastAsia"/>
+          <w:b/>
+          <w:bCs/>
+        </w:rPr>
+        <w:t>a specified valuation date</w:t>
+      </w:r>
+      <w:r>
+        <w:rPr>
+          <w:rFonts w:eastAsiaTheme="minorEastAsia" w:hint="eastAsia"/>
+        </w:rPr>
+        <w:t xml:space="preserve">. </w:t>
+      </w:r>
+    </w:p>
+    <w:p>
+      <w:pPr>
+        <w:pStyle w:val="a6"/>
         <w:spacing w:line="257" w:lineRule="auto"/>
-        <w:ind w:firstLineChars="0"/>
+        <w:ind w:left="440" w:firstLineChars="0" w:firstLine="0"/>
         <w:jc w:val="left"/>
         <w:rPr>
+          <w:rFonts w:eastAsiaTheme="minorEastAsia" w:hint="eastAsia"/>
+        </w:rPr>
+      </w:pPr>
+    </w:p>
+    <w:p>
+      <w:pPr>
+        <w:pStyle w:val="a6"/>
+        <w:spacing w:line="257" w:lineRule="auto"/>
+        <w:ind w:left="440" w:firstLineChars="0" w:firstLine="0"/>
+        <w:jc w:val="left"/>
+        <w:rPr>
           <w:rFonts w:eastAsiaTheme="minorEastAsia"/>
         </w:rPr>
       </w:pPr>
       <w:r>
         <w:rPr>
+          <w:rFonts w:eastAsiaTheme="minorEastAsia"/>
+        </w:rPr>
+        <w:t>The proposed use of the model is to provide an initial price estimate for a home without a recent</w:t>
+      </w:r>
+    </w:p>
+    <w:p>
+      <w:pPr>
+        <w:pStyle w:val="a6"/>
+        <w:spacing w:line="257" w:lineRule="auto"/>
+        <w:ind w:left="440" w:firstLineChars="0" w:firstLine="0"/>
+        <w:jc w:val="left"/>
+        <w:rPr>
+          <w:rFonts w:eastAsiaTheme="minorEastAsia"/>
+        </w:rPr>
+      </w:pPr>
+      <w:r>
+        <w:rPr>
+          <w:rFonts w:eastAsiaTheme="minorEastAsia"/>
+        </w:rPr>
+        <w:t>sale. This estimate is intended for a property analyst in the residential valuation team, who</w:t>
+      </w:r>
+      <w:r>
+        <w:rPr>
           <w:rFonts w:eastAsiaTheme="minorEastAsia" w:hint="eastAsia"/>
         </w:rPr>
-        <w:t xml:space="preserve">Improved consistency: the model can provide a reproducible starting point for comparable homes, reducing subjective variation. </w:t>
-      </w:r>
-    </w:p>
-    <w:p>
-      <w:pPr>
-        <w:pStyle w:val="ListParagraph"/>
-        <w:numPr>
-          <w:ilvl w:val="0"/>
-          <w:numId w:val="7"/>
-        </w:numPr>
+        <w:t xml:space="preserve"> </w:t>
+      </w:r>
+      <w:r>
+        <w:rPr>
+          <w:rFonts w:eastAsiaTheme="minorEastAsia"/>
+        </w:rPr>
+        <w:t>combines the model output with inspection information and professional judgement to determine</w:t>
+      </w:r>
+      <w:r>
+        <w:rPr>
+          <w:rFonts w:eastAsiaTheme="minorEastAsia" w:hint="eastAsia"/>
+        </w:rPr>
+        <w:t xml:space="preserve"> </w:t>
+      </w:r>
+      <w:r>
+        <w:rPr>
+          <w:rFonts w:eastAsiaTheme="minorEastAsia"/>
+        </w:rPr>
+        <w:t>the final assessed value. The process is explicitly human-in-the-loop: the model generates a first-pass estimate, and the analyst reviews and corrects it. The model does not directly generate tax</w:t>
+      </w:r>
+      <w:r>
+        <w:rPr>
+          <w:rFonts w:eastAsiaTheme="minorEastAsia" w:hint="eastAsia"/>
+        </w:rPr>
+        <w:t>.</w:t>
+      </w:r>
+    </w:p>
+    <w:p>
+      <w:pPr>
+        <w:pStyle w:val="a6"/>
         <w:spacing w:line="257" w:lineRule="auto"/>
-        <w:ind w:firstLineChars="0"/>
+        <w:ind w:left="440" w:firstLineChars="0" w:firstLine="0"/>
         <w:jc w:val="left"/>
         <w:rPr>
           <w:rFonts w:eastAsiaTheme="minorEastAsia"/>
         </w:rPr>
       </w:pPr>
-      <w:r>
+    </w:p>
+    <w:p>
+      <w:pPr>
+        <w:pStyle w:val="a6"/>
+        <w:spacing w:line="257" w:lineRule="auto"/>
+        <w:ind w:left="440" w:firstLineChars="0" w:firstLine="0"/>
+        <w:jc w:val="left"/>
         <w:rPr>
           <w:rFonts w:eastAsiaTheme="minorEastAsia" w:hint="eastAsia"/>
         </w:rPr>
-        <w:t>Scalability: a model-based approach supports the office</w:t>
-      </w:r>
+      </w:pPr>
       <w:r>
         <w:rPr>
           <w:rFonts w:eastAsiaTheme="minorEastAsia"/>
         </w:rPr>
-        <w:t>’</w:t>
+        <w:t>This project offers three practical benefits. First, it reduces repetitive manual work, because the</w:t>
       </w:r>
       <w:r>
         <w:rPr>
           <w:rFonts w:eastAsiaTheme="minorEastAsia" w:hint="eastAsia"/>
         </w:rPr>
-        <w:t xml:space="preserve">s need to value abundant properties at scale, which is preferable to pricing each home individually by hand. </w:t>
+        <w:t xml:space="preserve"> </w:t>
+      </w:r>
+      <w:r>
+        <w:rPr>
+          <w:rFonts w:eastAsiaTheme="minorEastAsia"/>
+        </w:rPr>
+        <w:t>model can generate initial estimates for large numbers of homes without recent sales in bulk</w:t>
+      </w:r>
+      <w:r>
+        <w:rPr>
+          <w:rFonts w:eastAsiaTheme="minorEastAsia" w:hint="eastAsia"/>
+        </w:rPr>
+        <w:t xml:space="preserve">, </w:t>
+      </w:r>
+      <w:r>
+        <w:rPr>
+          <w:rFonts w:eastAsiaTheme="minorEastAsia"/>
+        </w:rPr>
+        <w:t>allowing analysts to concentrate on reviewing and correcting estimates rather than pricing each</w:t>
+      </w:r>
+      <w:r>
+        <w:rPr>
+          <w:rFonts w:eastAsiaTheme="minorEastAsia" w:hint="eastAsia"/>
+        </w:rPr>
+        <w:t xml:space="preserve"> </w:t>
+      </w:r>
+      <w:r>
+        <w:rPr>
+          <w:rFonts w:eastAsiaTheme="minorEastAsia"/>
+        </w:rPr>
+        <w:t>home from scratch. Second, it improves consistency, as the model provides a reproducible starting</w:t>
+      </w:r>
+      <w:r>
+        <w:rPr>
+          <w:rFonts w:eastAsiaTheme="minorEastAsia" w:hint="eastAsia"/>
+        </w:rPr>
+        <w:t xml:space="preserve"> </w:t>
+      </w:r>
+      <w:r>
+        <w:rPr>
+          <w:rFonts w:eastAsiaTheme="minorEastAsia"/>
+        </w:rPr>
+        <w:t>point for comparable homes and thereby reduces subjective variation between analysts. Third, it</w:t>
+      </w:r>
+      <w:r>
+        <w:rPr>
+          <w:rFonts w:eastAsiaTheme="minorEastAsia" w:hint="eastAsia"/>
+        </w:rPr>
+        <w:t xml:space="preserve"> </w:t>
+      </w:r>
+      <w:r>
+        <w:rPr>
+          <w:rFonts w:eastAsiaTheme="minorEastAsia"/>
+        </w:rPr>
+        <w:t>supports scalability, since a model-based approach can value abundant properties at scale far</w:t>
+      </w:r>
+      <w:r>
+        <w:rPr>
+          <w:rFonts w:eastAsiaTheme="minorEastAsia" w:hint="eastAsia"/>
+        </w:rPr>
+        <w:t xml:space="preserve"> </w:t>
+      </w:r>
+      <w:r>
+        <w:rPr>
+          <w:rFonts w:eastAsiaTheme="minorEastAsia"/>
+        </w:rPr>
+        <w:t>more readily than pricing each home individually by hand</w:t>
       </w:r>
     </w:p>
     <w:p>
@@ -1841,16 +1866,7 @@
     </w:p>
     <w:p>
       <w:pPr>
-        <w:spacing w:line="257" w:lineRule="auto"/>
-        <w:jc w:val="left"/>
-        <w:rPr>
-          <w:rFonts w:eastAsiaTheme="minorEastAsia"/>
-        </w:rPr>
-      </w:pPr>
-    </w:p>
-    <w:p>
-      <w:pPr>
-        <w:pStyle w:val="ListParagraph"/>
+        <w:pStyle w:val="a6"/>
         <w:numPr>
           <w:ilvl w:val="0"/>
           <w:numId w:val="6"/>
@@ -2512,6 +2528,95 @@
     </w:lvl>
   </w:abstractNum>
   <w:abstractNum w:abstractNumId="2" w15:restartNumberingAfterBreak="0">
+    <w:nsid w:val="18825EB9"/>
+    <w:multiLevelType w:val="hybridMultilevel"/>
+    <w:tmpl w:val="428A0756"/>
+    <w:lvl w:ilvl="0" w:tplc="79D09C8E">
+      <w:start w:val="1"/>
+      <w:numFmt w:val="decimal"/>
+      <w:lvlText w:val="%1a."/>
+      <w:lvlJc w:val="left"/>
+      <w:pPr>
+        <w:ind w:left="440" w:hanging="440"/>
+      </w:pPr>
+      <w:rPr>
+        <w:rFonts w:hint="eastAsia"/>
+      </w:rPr>
+    </w:lvl>
+    <w:lvl w:ilvl="1" w:tplc="04090019" w:tentative="1">
+      <w:start w:val="1"/>
+      <w:numFmt w:val="lowerLetter"/>
+      <w:lvlText w:val="%2)"/>
+      <w:lvlJc w:val="left"/>
+      <w:pPr>
+        <w:ind w:left="880" w:hanging="440"/>
+      </w:pPr>
+    </w:lvl>
+    <w:lvl w:ilvl="2" w:tplc="0409001B" w:tentative="1">
+      <w:start w:val="1"/>
+      <w:numFmt w:val="lowerRoman"/>
+      <w:lvlText w:val="%3."/>
+      <w:lvlJc w:val="right"/>
+      <w:pPr>
+        <w:ind w:left="1320" w:hanging="440"/>
+      </w:pPr>
+    </w:lvl>
+    <w:lvl w:ilvl="3" w:tplc="0409000F" w:tentative="1">
+      <w:start w:val="1"/>
+      <w:numFmt w:val="decimal"/>
+      <w:lvlText w:val="%4."/>
+      <w:lvlJc w:val="left"/>
+      <w:pPr>
+        <w:ind w:left="1760" w:hanging="440"/>
+      </w:pPr>
+    </w:lvl>
+    <w:lvl w:ilvl="4" w:tplc="04090019" w:tentative="1">
+      <w:start w:val="1"/>
+      <w:numFmt w:val="lowerLetter"/>
+      <w:lvlText w:val="%5)"/>
+      <w:lvlJc w:val="left"/>
+      <w:pPr>
+        <w:ind w:left="2200" w:hanging="440"/>
+      </w:pPr>
+    </w:lvl>
+    <w:lvl w:ilvl="5" w:tplc="0409001B" w:tentative="1">
+      <w:start w:val="1"/>
+      <w:numFmt w:val="lowerRoman"/>
+      <w:lvlText w:val="%6."/>
+      <w:lvlJc w:val="right"/>
+      <w:pPr>
+        <w:ind w:left="2640" w:hanging="440"/>
+      </w:pPr>
+    </w:lvl>
+    <w:lvl w:ilvl="6" w:tplc="0409000F" w:tentative="1">
+      <w:start w:val="1"/>
+      <w:numFmt w:val="decimal"/>
+      <w:lvlText w:val="%7."/>
+      <w:lvlJc w:val="left"/>
+      <w:pPr>
+        <w:ind w:left="3080" w:hanging="440"/>
+      </w:pPr>
+    </w:lvl>
+    <w:lvl w:ilvl="7" w:tplc="04090019" w:tentative="1">
+      <w:start w:val="1"/>
+      <w:numFmt w:val="lowerLetter"/>
+      <w:lvlText w:val="%8)"/>
+      <w:lvlJc w:val="left"/>
+      <w:pPr>
+        <w:ind w:left="3520" w:hanging="440"/>
+      </w:pPr>
+    </w:lvl>
+    <w:lvl w:ilvl="8" w:tplc="0409001B" w:tentative="1">
+      <w:start w:val="1"/>
+      <w:numFmt w:val="lowerRoman"/>
+      <w:lvlText w:val="%9."/>
+      <w:lvlJc w:val="right"/>
+      <w:pPr>
+        <w:ind w:left="3960" w:hanging="440"/>
+      </w:pPr>
+    </w:lvl>
+  </w:abstractNum>
+  <w:abstractNum w:abstractNumId="3" w15:restartNumberingAfterBreak="0">
     <w:nsid w:val="304B7422"/>
     <w:multiLevelType w:val="hybridMultilevel"/>
     <w:tmpl w:val="FAF63480"/>
@@ -2723,7 +2828,7 @@
       </w:rPr>
     </w:lvl>
   </w:abstractNum>
-  <w:abstractNum w:abstractNumId="3" w15:restartNumberingAfterBreak="0">
+  <w:abstractNum w:abstractNumId="4" w15:restartNumberingAfterBreak="0">
     <w:nsid w:val="32053825"/>
     <w:multiLevelType w:val="hybridMultilevel"/>
     <w:tmpl w:val="35D6C05E"/>
@@ -2812,7 +2917,7 @@
       </w:pPr>
     </w:lvl>
   </w:abstractNum>
-  <w:abstractNum w:abstractNumId="4" w15:restartNumberingAfterBreak="0">
+  <w:abstractNum w:abstractNumId="5" w15:restartNumberingAfterBreak="0">
     <w:nsid w:val="42FE51F4"/>
     <w:multiLevelType w:val="hybridMultilevel"/>
     <w:tmpl w:val="A226018E"/>
@@ -3024,7 +3129,7 @@
       </w:rPr>
     </w:lvl>
   </w:abstractNum>
-  <w:abstractNum w:abstractNumId="5" w15:restartNumberingAfterBreak="0">
+  <w:abstractNum w:abstractNumId="6" w15:restartNumberingAfterBreak="0">
     <w:nsid w:val="4E073781"/>
     <w:multiLevelType w:val="hybridMultilevel"/>
     <w:tmpl w:val="2F88F9A2"/>
@@ -3113,14 +3218,14 @@
       </w:pPr>
     </w:lvl>
   </w:abstractNum>
-  <w:abstractNum w:abstractNumId="6" w15:restartNumberingAfterBreak="0">
+  <w:abstractNum w:abstractNumId="7" w15:restartNumberingAfterBreak="0">
     <w:nsid w:val="544073F8"/>
     <w:multiLevelType w:val="hybridMultilevel"/>
     <w:tmpl w:val="78BC3FD6"/>
     <w:lvl w:ilvl="0" w:tplc="789A1912">
       <w:start w:val="1"/>
       <w:numFmt w:val="decimal"/>
-      <w:pStyle w:val="Heading1"/>
+      <w:pStyle w:val="1"/>
       <w:lvlText w:val="%1"/>
       <w:lvlJc w:val="left"/>
       <w:pPr>
@@ -3339,22 +3444,25 @@
     <w:abstractNumId w:val="1"/>
   </w:num>
   <w:num w:numId="2" w16cid:durableId="1028333939">
-    <w:abstractNumId w:val="4"/>
+    <w:abstractNumId w:val="5"/>
   </w:num>
   <w:num w:numId="3" w16cid:durableId="2041003331">
-    <w:abstractNumId w:val="2"/>
+    <w:abstractNumId w:val="3"/>
   </w:num>
   <w:num w:numId="4" w16cid:durableId="543834558">
     <w:abstractNumId w:val="0"/>
   </w:num>
   <w:num w:numId="5" w16cid:durableId="1155144563">
+    <w:abstractNumId w:val="7"/>
+  </w:num>
+  <w:num w:numId="6" w16cid:durableId="322321522">
+    <w:abstractNumId w:val="4"/>
+  </w:num>
+  <w:num w:numId="7" w16cid:durableId="1626158007">
     <w:abstractNumId w:val="6"/>
   </w:num>
-  <w:num w:numId="6" w16cid:durableId="322321522">
-    <w:abstractNumId w:val="3"/>
-  </w:num>
-  <w:num w:numId="7" w16cid:durableId="1626158007">
-    <w:abstractNumId w:val="5"/>
+  <w:num w:numId="8" w16cid:durableId="1346588590">
+    <w:abstractNumId w:val="2"/>
   </w:num>
 </w:numbering>
 </file>
@@ -3756,7 +3864,7 @@
     <w:lsdException w:name="Unresolved Mention" w:semiHidden="1" w:unhideWhenUsed="1"/>
     <w:lsdException w:name="Smart Link" w:semiHidden="1" w:unhideWhenUsed="1"/>
   </w:latentStyles>
-  <w:style w:type="paragraph" w:default="1" w:styleId="Normal">
+  <w:style w:type="paragraph" w:default="1" w:styleId="a">
     <w:name w:val="Normal"/>
     <w:qFormat/>
     <w:rsid w:val="00A84538"/>
@@ -3769,10 +3877,10 @@
       <w:color w:val="000000"/>
     </w:rPr>
   </w:style>
-  <w:style w:type="paragraph" w:styleId="Heading1">
+  <w:style w:type="paragraph" w:styleId="1">
     <w:name w:val="heading 1"/>
-    <w:next w:val="Normal"/>
-    <w:link w:val="Heading1Char"/>
+    <w:next w:val="a"/>
+    <w:link w:val="10"/>
     <w:uiPriority w:val="9"/>
     <w:qFormat/>
     <w:pPr>
@@ -3792,10 +3900,10 @@
       <w:sz w:val="29"/>
     </w:rPr>
   </w:style>
-  <w:style w:type="paragraph" w:styleId="Heading2">
+  <w:style w:type="paragraph" w:styleId="2">
     <w:name w:val="heading 2"/>
-    <w:next w:val="Normal"/>
-    <w:link w:val="Heading2Char"/>
+    <w:next w:val="a"/>
+    <w:link w:val="20"/>
     <w:uiPriority w:val="9"/>
     <w:unhideWhenUsed/>
     <w:qFormat/>
@@ -3813,13 +3921,13 @@
       <w:sz w:val="24"/>
     </w:rPr>
   </w:style>
-  <w:style w:type="character" w:default="1" w:styleId="DefaultParagraphFont">
+  <w:style w:type="character" w:default="1" w:styleId="a0">
     <w:name w:val="Default Paragraph Font"/>
     <w:uiPriority w:val="1"/>
     <w:semiHidden/>
     <w:unhideWhenUsed/>
   </w:style>
-  <w:style w:type="table" w:default="1" w:styleId="TableNormal">
+  <w:style w:type="table" w:default="1" w:styleId="a1">
     <w:name w:val="Normal Table"/>
     <w:uiPriority w:val="99"/>
     <w:semiHidden/>
@@ -3834,15 +3942,15 @@
       </w:tblCellMar>
     </w:tblPr>
   </w:style>
-  <w:style w:type="numbering" w:default="1" w:styleId="NoList">
+  <w:style w:type="numbering" w:default="1" w:styleId="a2">
     <w:name w:val="No List"/>
     <w:uiPriority w:val="99"/>
     <w:semiHidden/>
     <w:unhideWhenUsed/>
   </w:style>
-  <w:style w:type="character" w:customStyle="1" w:styleId="Heading2Char">
-    <w:name w:val="Heading 2 Char"/>
-    <w:link w:val="Heading2"/>
+  <w:style w:type="character" w:customStyle="1" w:styleId="20">
+    <w:name w:val="标题 2 字符"/>
+    <w:link w:val="2"/>
     <w:rPr>
       <w:rFonts w:ascii="Times New Roman" w:eastAsia="Times New Roman" w:hAnsi="Times New Roman" w:cs="Times New Roman"/>
       <w:b/>
@@ -3850,9 +3958,9 @@
       <w:sz w:val="24"/>
     </w:rPr>
   </w:style>
-  <w:style w:type="character" w:customStyle="1" w:styleId="Heading1Char">
-    <w:name w:val="Heading 1 Char"/>
-    <w:link w:val="Heading1"/>
+  <w:style w:type="character" w:customStyle="1" w:styleId="10">
+    <w:name w:val="标题 1 字符"/>
+    <w:link w:val="1"/>
     <w:rPr>
       <w:rFonts w:ascii="Times New Roman" w:eastAsia="Times New Roman" w:hAnsi="Times New Roman" w:cs="Times New Roman"/>
       <w:b/>
@@ -3862,7 +3970,7 @@
   </w:style>
   <w:style w:type="paragraph" w:customStyle="1" w:styleId="footnotedescription">
     <w:name w:val="footnote description"/>
-    <w:next w:val="Normal"/>
+    <w:next w:val="a"/>
     <w:link w:val="footnotedescriptionChar"/>
     <w:hidden/>
     <w:pPr>
@@ -3908,10 +4016,10 @@
       </w:tblCellMar>
     </w:tblPr>
   </w:style>
-  <w:style w:type="paragraph" w:styleId="Header">
+  <w:style w:type="paragraph" w:styleId="a3">
     <w:name w:val="header"/>
-    <w:basedOn w:val="Normal"/>
-    <w:link w:val="HeaderChar"/>
+    <w:basedOn w:val="a"/>
+    <w:link w:val="a4"/>
     <w:uiPriority w:val="99"/>
     <w:unhideWhenUsed/>
     <w:rsid w:val="00810A2C"/>
@@ -3928,10 +4036,10 @@
       <w:szCs w:val="18"/>
     </w:rPr>
   </w:style>
-  <w:style w:type="character" w:customStyle="1" w:styleId="HeaderChar">
-    <w:name w:val="Header Char"/>
-    <w:basedOn w:val="DefaultParagraphFont"/>
-    <w:link w:val="Header"/>
+  <w:style w:type="character" w:customStyle="1" w:styleId="a4">
+    <w:name w:val="页眉 字符"/>
+    <w:basedOn w:val="a0"/>
+    <w:link w:val="a3"/>
     <w:uiPriority w:val="99"/>
     <w:rsid w:val="00810A2C"/>
     <w:rPr>
@@ -3941,9 +4049,9 @@
       <w:szCs w:val="18"/>
     </w:rPr>
   </w:style>
-  <w:style w:type="table" w:styleId="PlainTable3">
+  <w:style w:type="table" w:styleId="3">
     <w:name w:val="Plain Table 3"/>
-    <w:basedOn w:val="TableNormal"/>
+    <w:basedOn w:val="a1"/>
     <w:uiPriority w:val="43"/>
     <w:rsid w:val="00534EDB"/>
     <w:pPr>
@@ -4034,9 +4142,9 @@
       </w:tcPr>
     </w:tblStylePr>
   </w:style>
-  <w:style w:type="table" w:styleId="PlainTable1">
+  <w:style w:type="table" w:styleId="11">
     <w:name w:val="Plain Table 1"/>
-    <w:basedOn w:val="TableNormal"/>
+    <w:basedOn w:val="a1"/>
     <w:uiPriority w:val="41"/>
     <w:rsid w:val="00534EDB"/>
     <w:pPr>
@@ -4097,9 +4205,9 @@
       </w:tcPr>
     </w:tblStylePr>
   </w:style>
-  <w:style w:type="paragraph" w:styleId="NormalWeb">
+  <w:style w:type="paragraph" w:styleId="a5">
     <w:name w:val="Normal (Web)"/>
-    <w:basedOn w:val="Normal"/>
+    <w:basedOn w:val="a"/>
     <w:uiPriority w:val="99"/>
     <w:semiHidden/>
     <w:unhideWhenUsed/>
@@ -4108,9 +4216,9 @@
       <w:sz w:val="24"/>
     </w:rPr>
   </w:style>
-  <w:style w:type="paragraph" w:styleId="ListParagraph">
+  <w:style w:type="paragraph" w:styleId="a6">
     <w:name w:val="List Paragraph"/>
-    <w:basedOn w:val="Normal"/>
+    <w:basedOn w:val="a"/>
     <w:uiPriority w:val="34"/>
     <w:qFormat/>
     <w:rsid w:val="00C85792"/>

</xml_diff>